<commit_message>
ready for next steps
</commit_message>
<xml_diff>
--- a/lci-akzo-lotte-61463/LCI-61463-26-01-FL.docx
+++ b/lci-akzo-lotte-61463/LCI-61463-26-01-FL.docx
@@ -154,25 +154,7 @@
           <w:szCs w:val="20"/>
           <w:u w:val="none"/>
         </w:rPr>
-        <w:t>March 28</w:t>
-      </w:r>
-      <w:r>
-        <w:rPr>
-          <w:color w:val="auto"/>
-          <w:sz w:val="20"/>
-          <w:szCs w:val="20"/>
-          <w:u w:val="none"/>
-        </w:rPr>
-        <w:t>, 202</w:t>
-      </w:r>
-      <w:r>
-        <w:rPr>
-          <w:color w:val="auto"/>
-          <w:sz w:val="20"/>
-          <w:szCs w:val="20"/>
-          <w:u w:val="none"/>
-        </w:rPr>
-        <w:t>6</w:t>
+        <w:t>March 28, 2026</w:t>
       </w:r>
     </w:p>
     <w:p>
@@ -529,136 +511,6 @@
           <w:szCs w:val="20"/>
         </w:rPr>
         <w:t>LUCKY CORE INDUSTRIES LIMITED (FORMERLY: ICI PAKISTAN LIMITED)</w:t>
-      </w:r>
-      <w:r>
-        <w:rPr>
-          <w:b/>
-          <w:bCs/>
-          <w:sz w:val="20"/>
-          <w:szCs w:val="20"/>
-        </w:rPr>
-        <w:fldChar w:fldCharType="end"/>
-      </w:r>
-    </w:p>
-    <w:p>
-      <w:pPr>
-        <w:pStyle w:val="Default"/>
-        <w:numPr>
-          <w:ilvl w:val="0"/>
-          <w:numId w:val="2"/>
-        </w:numPr>
-        <w:tabs>
-          <w:tab w:val="clear" w:pos="720"/>
-          <w:tab w:val="left" w:pos="400" w:leader="none"/>
-        </w:tabs>
-        <w:bidi w:val="0"/>
-        <w:jc w:val="start"/>
-        <w:rPr>
-          <w:rFonts w:ascii="Calibri" w:hAnsi="Calibri"/>
-          <w:sz w:val="20"/>
-          <w:szCs w:val="20"/>
-        </w:rPr>
-      </w:pPr>
-      <w:r>
-        <w:rPr>
-          <w:b/>
-          <w:bCs/>
-          <w:sz w:val="20"/>
-          <w:szCs w:val="20"/>
-        </w:rPr>
-        <w:fldChar w:fldCharType="begin"/>
-      </w:r>
-      <w:r>
-        <w:rPr>
-          <w:b/>
-          <w:bCs/>
-          <w:sz w:val="20"/>
-          <w:szCs w:val="20"/>
-        </w:rPr>
-        <w:instrText xml:space="preserve"> DOCPROPERTY "Company2"</w:instrText>
-      </w:r>
-      <w:r>
-        <w:rPr>
-          <w:b/>
-          <w:bCs/>
-          <w:sz w:val="20"/>
-          <w:szCs w:val="20"/>
-        </w:rPr>
-        <w:fldChar w:fldCharType="separate"/>
-      </w:r>
-      <w:r>
-        <w:rPr>
-          <w:b/>
-          <w:bCs/>
-          <w:sz w:val="20"/>
-          <w:szCs w:val="20"/>
-        </w:rPr>
-        <w:t>AKZO NOBEL PAKISTAN LIMITED</w:t>
-      </w:r>
-      <w:r>
-        <w:rPr>
-          <w:b/>
-          <w:bCs/>
-          <w:sz w:val="20"/>
-          <w:szCs w:val="20"/>
-        </w:rPr>
-        <w:fldChar w:fldCharType="end"/>
-      </w:r>
-    </w:p>
-    <w:p>
-      <w:pPr>
-        <w:pStyle w:val="Default"/>
-        <w:numPr>
-          <w:ilvl w:val="0"/>
-          <w:numId w:val="2"/>
-        </w:numPr>
-        <w:tabs>
-          <w:tab w:val="clear" w:pos="720"/>
-          <w:tab w:val="left" w:pos="400" w:leader="none"/>
-        </w:tabs>
-        <w:bidi w:val="0"/>
-        <w:jc w:val="start"/>
-        <w:rPr>
-          <w:rFonts w:ascii="Calibri" w:hAnsi="Calibri"/>
-          <w:sz w:val="20"/>
-          <w:szCs w:val="20"/>
-        </w:rPr>
-      </w:pPr>
-      <w:r>
-        <w:rPr>
-          <w:b/>
-          <w:bCs/>
-          <w:sz w:val="20"/>
-          <w:szCs w:val="20"/>
-        </w:rPr>
-        <w:fldChar w:fldCharType="begin"/>
-      </w:r>
-      <w:r>
-        <w:rPr>
-          <w:b/>
-          <w:bCs/>
-          <w:sz w:val="20"/>
-          <w:szCs w:val="20"/>
-        </w:rPr>
-        <w:instrText xml:space="preserve"> DOCPROPERTY "Company3"</w:instrText>
-      </w:r>
-      <w:r>
-        <w:rPr>
-          <w:b/>
-          <w:bCs/>
-          <w:sz w:val="20"/>
-          <w:szCs w:val="20"/>
-        </w:rPr>
-        <w:fldChar w:fldCharType="separate"/>
-      </w:r>
-      <w:r>
-        <w:rPr>
-          <w:b/>
-          <w:bCs/>
-          <w:sz w:val="20"/>
-          <w:szCs w:val="20"/>
-        </w:rPr>
-        <w:t>LOTTE CHEMICAL PAKISTAN LIMITED</w:t>
       </w:r>
       <w:r>
         <w:rPr>

</xml_diff>